<commit_message>
v2.5: no DEFEAT (fight to the last fighter, then GAME OVER), full LOST: nnn HACKERS mm GURUS, Dependency Hell wording
Co-Authored-By: Claude Sonnet 5.5 <noreply@anthropic.com>
Claude-Session: https://claude.ai/code/session_014MnrG7cc1Hws3poqmcDFnM
</commit_message>
<xml_diff>
--- a/instructions_v2.5.docx
+++ b/instructions_v2.5.docx
@@ -225,7 +225,7 @@
         <w:rPr>
           <w:lang w:val="en-GB"/>
         </w:rPr>
-        <w:t xml:space="preserve"> with a RAM module (CE-151 or larger). The recording holds the program without its REM lines (5742 bytes); with its variables it needs about 5.9 KB of memory, so it does not fit into a PC-1500 or PC-2 without a module.</w:t>
+        <w:t xml:space="preserve"> with a RAM module (CE-151 or larger). The recording holds the program without its REM lines (5679 bytes); with its variables it needs about 5.9 KB of memory, so it does not fit into a PC-1500 or PC-2 without a module.</w:t>
       </w:r>
     </w:p>
     <w:p>
@@ -1413,7 +1413,7 @@
         <w:rPr>
           <w:lang w:val="en-GB"/>
         </w:rPr>
-        <w:t xml:space="preserve"> fight in every fight, all of them, and stay with you until they are eliminated. They strike with a huge, carefully prepared Dependency Hell of links and corruption, which paralyses the Tech Priests’ systems and ends in crashes or a thermal infernal meltdown: a Guru who strikes eliminates 40 Tech Priests. Groups of Tech Priests hunt them, and a Guru who faces more than 10 Tech Priests at once may fall. Gurus are hired – but after a won fight some may also join you of their own accord (see You won).</w:t>
+        <w:t xml:space="preserve"> fight in every fight, all of them, and stay with you until they are eliminated. Their weapon is Dependency Hell: they tangle the Tech Priests’ systems in conflicting library versions, circular and unresolvable dependencies, broken links and corrupted files and data, so that nothing can be built, updated or started any more – and it all ends in cascading failures, crashes and a meltdown. A Guru who strikes eliminates 40 Tech Priests. Groups of Tech Priests hunt them, and a Guru who faces more than 10 Tech Priests at once may fall. Gurus are hired – but after a won fight some may also join you of their own accord (see You won).</w:t>
       </w:r>
     </w:p>
     <w:p>
@@ -3703,7 +3703,7 @@
           <w:rFonts w:ascii="Courier New" w:eastAsia="Courier New" w:hAnsi="Courier New" w:cs="Courier New"/>
           <w:lang w:val="en-GB"/>
         </w:rPr>
-        <w:t xml:space="preserve">LOST:mH jU</w:t>
+        <w:t xml:space="preserve">LOST: nnn HACKERS mm GURUS</w:t>
       </w:r>
     </w:p>
     <w:p>
@@ -3729,13 +3729,13 @@
           <w:rFonts w:ascii="Courier New" w:eastAsia="Courier New" w:hAnsi="Courier New" w:cs="Courier New"/>
           <w:lang w:val="en-GB"/>
         </w:rPr>
-        <w:t xml:space="preserve">LOST:7H 1U</w:t>
-      </w:r>
-      <w:r>
-        <w:rPr>
-          <w:lang w:val="en-GB"/>
-        </w:rPr>
-        <w:t xml:space="preserve"> (H Hackers, U Gurus).</w:t>
+        <w:t xml:space="preserve">LOST: 7 HACKERS 1 GURUS</w:t>
+      </w:r>
+      <w:r>
+        <w:rPr>
+          <w:lang w:val="en-GB"/>
+        </w:rPr>
+        <w:t xml:space="preserve">.</w:t>
       </w:r>
     </w:p>
     <w:p>
@@ -3922,7 +3922,7 @@
         <w:rPr>
           <w:lang w:val="en-GB"/>
         </w:rPr>
-        <w:t>You lost or are defeated</w:t>
+        <w:t xml:space="preserve">You lose</w:t>
       </w:r>
     </w:p>
     <w:p>
@@ -3936,72 +3936,46 @@
         <w:rPr>
           <w:lang w:val="en-GB"/>
         </w:rPr>
-        <w:t xml:space="preserve">If all your fighting Hackers and Gurus fall, you are defeated: </w:t>
+        <w:t xml:space="preserve">The fight goes on to the last of your fighters, unless you surrender. If all your fighting Hackers and Gurus fall, the game is over, even if some Hackers stayed at home: with no one left to lead the fight, the commander is finished too. You see </w:t>
       </w:r>
       <w:r>
         <w:rPr>
           <w:rFonts w:ascii="Courier New" w:eastAsia="Courier New" w:hAnsi="Courier New" w:cs="Courier New"/>
           <w:lang w:val="en-GB"/>
         </w:rPr>
-        <w:t xml:space="preserve">YOU WERE DEFEATED!</w:t>
-      </w:r>
-      <w:r>
-        <w:rPr>
-          <w:lang w:val="en-GB"/>
-        </w:rPr>
-        <w:t xml:space="preserve"> and your losses are shown. The place keeps the Tech Priests it has left, and you keep the Hackers who stayed at home and the weapons that were not thrown. Only when you have no Hacker at home either, the game is over: </w:t>
+        <w:t xml:space="preserve">NO ONE LEFT!</w:t>
+      </w:r>
+      <w:r>
+        <w:rPr>
+          <w:lang w:val="en-GB"/>
+        </w:rPr>
+        <w:t xml:space="preserve">, </w:t>
       </w:r>
       <w:r>
         <w:rPr>
           <w:rFonts w:ascii="Courier New" w:eastAsia="Courier New" w:hAnsi="Courier New" w:cs="Courier New"/>
           <w:lang w:val="en-GB"/>
         </w:rPr>
-        <w:t xml:space="preserve">NO ONE LEFT!</w:t>
-      </w:r>
-      <w:r>
-        <w:rPr>
-          <w:lang w:val="en-GB"/>
-        </w:rPr>
-        <w:t xml:space="preserve">, </w:t>
+        <w:t xml:space="preserve">YOU LOST!</w:t>
+      </w:r>
+      <w:r>
+        <w:rPr>
+          <w:lang w:val="en-GB"/>
+        </w:rPr>
+        <w:t xml:space="preserve"> and </w:t>
       </w:r>
       <w:r>
         <w:rPr>
           <w:rFonts w:ascii="Courier New" w:eastAsia="Courier New" w:hAnsi="Courier New" w:cs="Courier New"/>
           <w:lang w:val="en-GB"/>
         </w:rPr>
-        <w:t xml:space="preserve">YOU LOST!</w:t>
-      </w:r>
-      <w:r>
-        <w:rPr>
-          <w:lang w:val="en-GB"/>
-        </w:rPr>
-        <w:t xml:space="preserve"> and </w:t>
-      </w:r>
-      <w:r>
-        <w:rPr>
-          <w:rFonts w:ascii="Courier New" w:eastAsia="Courier New" w:hAnsi="Courier New" w:cs="Courier New"/>
-          <w:lang w:val="en-GB"/>
-        </w:rPr>
-        <w:t xml:space="preserve">GAME OVER! Priests won!</w:t>
-      </w:r>
-      <w:r>
-        <w:rPr>
-          <w:lang w:val="en-GB"/>
-        </w:rPr>
-        <w:t xml:space="preserve">. Then the game shows the treasure of the last place you conquered, or </w:t>
-      </w:r>
-      <w:r>
-        <w:rPr>
-          <w:rFonts w:ascii="Courier New" w:eastAsia="Courier New" w:hAnsi="Courier New" w:cs="Courier New"/>
-          <w:lang w:val="en-GB"/>
-        </w:rPr>
-        <w:t xml:space="preserve">lesson in humility..</w:t>
-      </w:r>
-      <w:r>
-        <w:rPr>
-          <w:lang w:val="en-GB"/>
-        </w:rPr>
-        <w:t xml:space="preserve"> if you have not conquered any.</w:t>
+        <w:t xml:space="preserve">GAME OVER! Priests won!</w:t>
+      </w:r>
+      <w:r>
+        <w:rPr>
+          <w:lang w:val="en-GB"/>
+        </w:rPr>
+        <w:t xml:space="preserve">. Then the game shows the treasure of the last place you conquered, or lesson in humility.. if you have not conquered any. The only way to leave a lost fight alive is to surrender (S).</w:t>
       </w:r>
     </w:p>
     <w:p>
@@ -5204,46 +5178,7 @@
         <w:rPr>
           <w:lang w:val="en-GB"/>
         </w:rPr>
-        <w:t xml:space="preserve">You win the war when all ten places are yours: </w:t>
-      </w:r>
-      <w:r>
-        <w:rPr>
-          <w:rFonts w:ascii="Courier New" w:eastAsia="Courier New" w:hAnsi="Courier New" w:cs="Courier New"/>
-          <w:lang w:val="en-GB"/>
-        </w:rPr>
-        <w:t xml:space="preserve">ALL BASTIONS ARE YOURS!</w:t>
-      </w:r>
-      <w:r>
-        <w:rPr>
-          <w:lang w:val="en-GB"/>
-        </w:rPr>
-        <w:t xml:space="preserve"> and </w:t>
-      </w:r>
-      <w:r>
-        <w:rPr>
-          <w:rFonts w:ascii="Courier New" w:eastAsia="Courier New" w:hAnsi="Courier New" w:cs="Courier New"/>
-          <w:lang w:val="en-GB"/>
-        </w:rPr>
-        <w:t xml:space="preserve">YOU BEAT THE TECH PRIESTS!</w:t>
-      </w:r>
-      <w:r>
-        <w:rPr>
-          <w:lang w:val="en-GB"/>
-        </w:rPr>
-        <w:t xml:space="preserve">. You lose when none of your people are left: </w:t>
-      </w:r>
-      <w:r>
-        <w:rPr>
-          <w:rFonts w:ascii="Courier New" w:eastAsia="Courier New" w:hAnsi="Courier New" w:cs="Courier New"/>
-          <w:lang w:val="en-GB"/>
-        </w:rPr>
-        <w:t xml:space="preserve">GAME OVER! Priests won!</w:t>
-      </w:r>
-      <w:r>
-        <w:rPr>
-          <w:lang w:val="en-GB"/>
-        </w:rPr>
-        <w:t xml:space="preserve">.</w:t>
+        <w:t xml:space="preserve">You win the war when all ten places are yours: ALL BASTIONS ARE YOURS! and YOU BEAT THE TECH PRIESTS!. You lose when all your fighters fall and you did not surrender: NO ONE LEFT!, YOU LOST!, GAME OVER! Priests won!.</w:t>
       </w:r>
     </w:p>
     <w:p>
@@ -5365,7 +5300,7 @@
         <w:rPr>
           <w:lang w:val="en-GB"/>
         </w:rPr>
-        <w:t xml:space="preserve">Take as many Hackers as the weapons need: they must stay alive while the weapons are thrown, which takes about six rounds. In big places the Tech Priests eliminate your Hackers fast, so take a good part of them – but keep some at home, for they are the ones who survive a lost battle.</w:t>
+        <w:t xml:space="preserve">Take as many Hackers as the weapons need: they must stay alive while the weapons are thrown, which takes about six rounds. In big places the Tech Priests eliminate your Hackers fast, so take a good part of them – but remember that when all your fighters fall the game is over, so surrender in time (S) while you can still save your people.</w:t>
       </w:r>
     </w:p>
     <w:p>

</xml_diff>